<commit_message>
update 091125 5:12 pm
</commit_message>
<xml_diff>
--- a/customer service/speech therapist/speech-therapist-config-v4.docx
+++ b/customer service/speech therapist/speech-therapist-config-v4.docx
@@ -4172,6 +4172,9 @@
         <w:spacing w:before="100" w:beforeAutospacing="1" w:after="100" w:afterAutospacing="1" w:line="240" w:lineRule="auto"/>
         <w:rPr>
           <w:rFonts w:eastAsia="Times New Roman" w:cs="Times New Roman"/>
+          <w:b/>
+          <w:bCs/>
+          <w:color w:val="EE0000"/>
           <w:kern w:val="0"/>
           <w14:ligatures w14:val="none"/>
         </w:rPr>
@@ -4190,7 +4193,18 @@
           <w:kern w:val="0"/>
           <w14:ligatures w14:val="none"/>
         </w:rPr>
-        <w:t xml:space="preserve"> Calendar.google.com</w:t>
+        <w:t xml:space="preserve"> </w:t>
+      </w:r>
+      <w:r>
+        <w:rPr>
+          <w:rFonts w:eastAsia="Times New Roman" w:cs="Times New Roman"/>
+          <w:b/>
+          <w:bCs/>
+          <w:color w:val="EE0000"/>
+          <w:kern w:val="0"/>
+          <w14:ligatures w14:val="none"/>
+        </w:rPr>
+        <w:t>Calendar.google.com</w:t>
       </w:r>
     </w:p>
     <w:p>

</xml_diff>